<commit_message>
Add mermaid diagram for documentation
</commit_message>
<xml_diff>
--- a/documentación/Requerimiento_Funcional_Detallado_AOCR.docx
+++ b/documentación/Requerimiento_Funcional_Detallado_AOCR.docx
@@ -7,6 +7,8 @@
         <w:spacing w:after="40"/>
         <w:jc w:val="center"/>
       </w:pPr>
+      <w:bookmarkStart w:id="0" w:name="_GoBack"/>
+      <w:bookmarkEnd w:id="0"/>
       <w:r>
         <w:rPr>
           <w:b/>
@@ -130,12 +132,6 @@
               <w:rPr>
                 <w:sz w:val="15"/>
               </w:rPr>
-              <w:t>D</w:t>
-            </w:r>
-            <w:r>
-              <w:rPr>
-                <w:sz w:val="15"/>
-              </w:rPr>
               <w:t>TIC-PROY-2026-RF-001</w:t>
             </w:r>
           </w:p>
@@ -323,31 +319,7 @@
               <w:rPr>
                 <w:sz w:val="16"/>
               </w:rPr>
-              <w:t>(</w:t>
-            </w:r>
-            <w:r>
-              <w:rPr>
-                <w:sz w:val="16"/>
-              </w:rPr>
-              <w:t>X</w:t>
-            </w:r>
-            <w:r>
-              <w:rPr>
-                <w:sz w:val="16"/>
-              </w:rPr>
-              <w:t xml:space="preserve"> ) Nuevo Sistema / Componente / Módulo     </w:t>
-            </w:r>
-            <w:r>
-              <w:rPr>
-                <w:sz w:val="16"/>
-              </w:rPr>
-              <w:t>(</w:t>
-            </w:r>
-            <w:r>
-              <w:rPr>
-                <w:sz w:val="16"/>
-              </w:rPr>
-              <w:t>) Cambio Sistema / Componente / Módulo Existente     ( ) Soporte procesamiento de datos     ( ) Nuevo / Cambio a Reporte     (X) Proceso informático online</w:t>
+              <w:t>( ) Nuevo Sistema / Componente / Módulo     (X) Cambio Sistema / Componente / Módulo Existente     ( ) Soporte procesamiento de datos     ( ) Nuevo / Cambio a Reporte     (X) Proceso informático online</w:t>
             </w:r>
           </w:p>
         </w:tc>
@@ -9433,12 +9405,8 @@
       </w:r>
     </w:p>
     <w:sectPr>
-      <w:headerReference w:type="even" r:id="rId16"/>
-      <w:headerReference w:type="default" r:id="rId17"/>
-      <w:footerReference w:type="even" r:id="rId18"/>
-      <w:footerReference w:type="default" r:id="rId19"/>
-      <w:headerReference w:type="first" r:id="rId20"/>
-      <w:footerReference w:type="first" r:id="rId21"/>
+      <w:headerReference w:type="default" r:id="rId16"/>
+      <w:footerReference w:type="default" r:id="rId17"/>
       <w:pgSz w:w="11907" w:h="16839" w:code="9"/>
       <w:pgMar w:top="907" w:right="794" w:bottom="794" w:left="794" w:header="1021" w:footer="227" w:gutter="0"/>
       <w:cols w:space="720"/>
@@ -9468,16 +9436,6 @@
 </file>
 
 <file path=word/footer1.xml><?xml version="1.0" encoding="utf-8"?>
-<w:ftr xmlns:wpc="http://schemas.microsoft.com/office/word/2010/wordprocessingCanvas" xmlns:mc="http://schemas.openxmlformats.org/markup-compatibility/2006" xmlns:o="urn:schemas-microsoft-com:office:office" xmlns:r="http://schemas.openxmlformats.org/officeDocument/2006/relationships" xmlns:m="http://schemas.openxmlformats.org/officeDocument/2006/math" xmlns:v="urn:schemas-microsoft-com:vml" xmlns:wp14="http://schemas.microsoft.com/office/word/2010/wordprocessingDrawing" xmlns:wp="http://schemas.openxmlformats.org/drawingml/2006/wordprocessingDrawing" xmlns:w10="urn:schemas-microsoft-com:office:word" xmlns:w="http://schemas.openxmlformats.org/wordprocessingml/2006/main" xmlns:w14="http://schemas.microsoft.com/office/word/2010/wordml" xmlns:w15="http://schemas.microsoft.com/office/word/2012/wordml" xmlns:wpg="http://schemas.microsoft.com/office/word/2010/wordprocessingGroup" xmlns:wpi="http://schemas.microsoft.com/office/word/2010/wordprocessingInk" xmlns:wne="http://schemas.microsoft.com/office/word/2006/wordml" xmlns:wps="http://schemas.microsoft.com/office/word/2010/wordprocessingShape" mc:Ignorable="w14 w15 wp14">
-  <w:p>
-    <w:pPr>
-      <w:pStyle w:val="Piedepgina"/>
-    </w:pPr>
-  </w:p>
-</w:ftr>
-</file>
-
-<file path=word/footer2.xml><?xml version="1.0" encoding="utf-8"?>
 <w:ftr xmlns:wpc="http://schemas.microsoft.com/office/word/2010/wordprocessingCanvas" xmlns:mc="http://schemas.openxmlformats.org/markup-compatibility/2006" xmlns:o="urn:schemas-microsoft-com:office:office" xmlns:r="http://schemas.openxmlformats.org/officeDocument/2006/relationships" xmlns:m="http://schemas.openxmlformats.org/officeDocument/2006/math" xmlns:v="urn:schemas-microsoft-com:vml" xmlns:wp14="http://schemas.microsoft.com/office/word/2010/wordprocessingDrawing" xmlns:wp="http://schemas.openxmlformats.org/drawingml/2006/wordprocessingDrawing" xmlns:w10="urn:schemas-microsoft-com:office:word" xmlns:w="http://schemas.openxmlformats.org/wordprocessingml/2006/main" xmlns:w14="http://schemas.microsoft.com/office/word/2010/wordml" xmlns:w15="http://schemas.microsoft.com/office/word/2012/wordml" xmlns:wpg="http://schemas.microsoft.com/office/word/2010/wordprocessingGroup" xmlns:wpi="http://schemas.microsoft.com/office/word/2010/wordprocessingInk" xmlns:wne="http://schemas.microsoft.com/office/word/2006/wordml" xmlns:wps="http://schemas.microsoft.com/office/word/2010/wordprocessingShape" mc:Ignorable="w14 w15 wp14">
   <w:p>
     <w:pPr>
@@ -9629,16 +9587,6 @@
 </w:ftr>
 </file>
 
-<file path=word/footer3.xml><?xml version="1.0" encoding="utf-8"?>
-<w:ftr xmlns:wpc="http://schemas.microsoft.com/office/word/2010/wordprocessingCanvas" xmlns:mc="http://schemas.openxmlformats.org/markup-compatibility/2006" xmlns:o="urn:schemas-microsoft-com:office:office" xmlns:r="http://schemas.openxmlformats.org/officeDocument/2006/relationships" xmlns:m="http://schemas.openxmlformats.org/officeDocument/2006/math" xmlns:v="urn:schemas-microsoft-com:vml" xmlns:wp14="http://schemas.microsoft.com/office/word/2010/wordprocessingDrawing" xmlns:wp="http://schemas.openxmlformats.org/drawingml/2006/wordprocessingDrawing" xmlns:w10="urn:schemas-microsoft-com:office:word" xmlns:w="http://schemas.openxmlformats.org/wordprocessingml/2006/main" xmlns:w14="http://schemas.microsoft.com/office/word/2010/wordml" xmlns:w15="http://schemas.microsoft.com/office/word/2012/wordml" xmlns:wpg="http://schemas.microsoft.com/office/word/2010/wordprocessingGroup" xmlns:wpi="http://schemas.microsoft.com/office/word/2010/wordprocessingInk" xmlns:wne="http://schemas.microsoft.com/office/word/2006/wordml" xmlns:wps="http://schemas.microsoft.com/office/word/2010/wordprocessingShape" mc:Ignorable="w14 w15 wp14">
-  <w:p>
-    <w:pPr>
-      <w:pStyle w:val="Piedepgina"/>
-    </w:pPr>
-  </w:p>
-</w:ftr>
-</file>
-
 <file path=word/footnotes.xml><?xml version="1.0" encoding="utf-8"?>
 <w:footnotes xmlns:wpc="http://schemas.microsoft.com/office/word/2010/wordprocessingCanvas" xmlns:mc="http://schemas.openxmlformats.org/markup-compatibility/2006" xmlns:o="urn:schemas-microsoft-com:office:office" xmlns:r="http://schemas.openxmlformats.org/officeDocument/2006/relationships" xmlns:m="http://schemas.openxmlformats.org/officeDocument/2006/math" xmlns:v="urn:schemas-microsoft-com:vml" xmlns:wp14="http://schemas.microsoft.com/office/word/2010/wordprocessingDrawing" xmlns:wp="http://schemas.openxmlformats.org/drawingml/2006/wordprocessingDrawing" xmlns:w10="urn:schemas-microsoft-com:office:word" xmlns:w="http://schemas.openxmlformats.org/wordprocessingml/2006/main" xmlns:w14="http://schemas.microsoft.com/office/word/2010/wordml" xmlns:w15="http://schemas.microsoft.com/office/word/2012/wordml" xmlns:wpg="http://schemas.microsoft.com/office/word/2010/wordprocessingGroup" xmlns:wpi="http://schemas.microsoft.com/office/word/2010/wordprocessingInk" xmlns:wne="http://schemas.microsoft.com/office/word/2006/wordml" xmlns:wps="http://schemas.microsoft.com/office/word/2010/wordprocessingShape" mc:Ignorable="w14 w15 wp14">
   <w:footnote w:type="separator" w:id="-1">
@@ -9660,16 +9608,6 @@
 
 <file path=word/header1.xml><?xml version="1.0" encoding="utf-8"?>
 <w:hdr xmlns:wpc="http://schemas.microsoft.com/office/word/2010/wordprocessingCanvas" xmlns:mc="http://schemas.openxmlformats.org/markup-compatibility/2006" xmlns:o="urn:schemas-microsoft-com:office:office" xmlns:r="http://schemas.openxmlformats.org/officeDocument/2006/relationships" xmlns:m="http://schemas.openxmlformats.org/officeDocument/2006/math" xmlns:v="urn:schemas-microsoft-com:vml" xmlns:wp14="http://schemas.microsoft.com/office/word/2010/wordprocessingDrawing" xmlns:wp="http://schemas.openxmlformats.org/drawingml/2006/wordprocessingDrawing" xmlns:w10="urn:schemas-microsoft-com:office:word" xmlns:w="http://schemas.openxmlformats.org/wordprocessingml/2006/main" xmlns:w14="http://schemas.microsoft.com/office/word/2010/wordml" xmlns:w15="http://schemas.microsoft.com/office/word/2012/wordml" xmlns:wpg="http://schemas.microsoft.com/office/word/2010/wordprocessingGroup" xmlns:wpi="http://schemas.microsoft.com/office/word/2010/wordprocessingInk" xmlns:wne="http://schemas.microsoft.com/office/word/2006/wordml" xmlns:wps="http://schemas.microsoft.com/office/word/2010/wordprocessingShape" mc:Ignorable="w14 w15 wp14">
-  <w:p>
-    <w:pPr>
-      <w:pStyle w:val="Encabezado"/>
-    </w:pPr>
-  </w:p>
-</w:hdr>
-</file>
-
-<file path=word/header2.xml><?xml version="1.0" encoding="utf-8"?>
-<w:hdr xmlns:wpc="http://schemas.microsoft.com/office/word/2010/wordprocessingCanvas" xmlns:mc="http://schemas.openxmlformats.org/markup-compatibility/2006" xmlns:o="urn:schemas-microsoft-com:office:office" xmlns:r="http://schemas.openxmlformats.org/officeDocument/2006/relationships" xmlns:m="http://schemas.openxmlformats.org/officeDocument/2006/math" xmlns:v="urn:schemas-microsoft-com:vml" xmlns:wp14="http://schemas.microsoft.com/office/word/2010/wordprocessingDrawing" xmlns:wp="http://schemas.openxmlformats.org/drawingml/2006/wordprocessingDrawing" xmlns:w10="urn:schemas-microsoft-com:office:word" xmlns:w="http://schemas.openxmlformats.org/wordprocessingml/2006/main" xmlns:w14="http://schemas.microsoft.com/office/word/2010/wordml" xmlns:w15="http://schemas.microsoft.com/office/word/2012/wordml" xmlns:wpg="http://schemas.microsoft.com/office/word/2010/wordprocessingGroup" xmlns:wpi="http://schemas.microsoft.com/office/word/2010/wordprocessingInk" xmlns:wne="http://schemas.microsoft.com/office/word/2006/wordml" xmlns:wps="http://schemas.microsoft.com/office/word/2010/wordprocessingShape" mc:Ignorable="w14 w15 wp14">
   <w:tbl>
     <w:tblPr>
       <w:tblW w:w="9423" w:type="dxa"/>
@@ -9689,10 +9627,10 @@
       <w:tblLook w:val="04A0" w:firstRow="1" w:lastRow="0" w:firstColumn="1" w:lastColumn="0" w:noHBand="0" w:noVBand="1"/>
     </w:tblPr>
     <w:tblGrid>
-      <w:gridCol w:w="2480"/>
+      <w:gridCol w:w="3185"/>
       <w:gridCol w:w="3969"/>
-      <w:gridCol w:w="1000"/>
-      <w:gridCol w:w="1974"/>
+      <w:gridCol w:w="862"/>
+      <w:gridCol w:w="1407"/>
     </w:tblGrid>
     <w:tr>
       <w:trPr>
@@ -9717,7 +9655,6 @@
               <w:lang w:eastAsia="es-EC"/>
             </w:rPr>
           </w:pPr>
-          <w:bookmarkStart w:id="0" w:name="_GoBack"/>
           <w:r>
             <w:rPr>
               <w:rFonts w:ascii="Calibri" w:eastAsia="Times New Roman" w:hAnsi="Calibri" w:cs="Calibri"/>
@@ -9727,26 +9664,32 @@
               <w:lang w:eastAsia="es-EC"/>
             </w:rPr>
             <w:drawing>
-              <wp:anchor distT="0" distB="0" distL="114300" distR="114300" simplePos="0" relativeHeight="251658240" behindDoc="1" locked="0" layoutInCell="1" allowOverlap="1" wp14:anchorId="2CF85B8F" wp14:editId="4B943EAC">
+              <wp:anchor distT="0" distB="0" distL="114300" distR="114300" simplePos="0" relativeHeight="251659264" behindDoc="1" locked="0" layoutInCell="1" allowOverlap="1" wp14:anchorId="7B92EF49" wp14:editId="7165B6C1">
                 <wp:simplePos x="0" y="0"/>
                 <wp:positionH relativeFrom="column">
-                  <wp:posOffset>-2540</wp:posOffset>
+                  <wp:posOffset>370205</wp:posOffset>
                 </wp:positionH>
                 <wp:positionV relativeFrom="paragraph">
-                  <wp:posOffset>516890</wp:posOffset>
+                  <wp:posOffset>-7620</wp:posOffset>
                 </wp:positionV>
-                <wp:extent cx="1485900" cy="269875"/>
+                <wp:extent cx="1270635" cy="657225"/>
                 <wp:effectExtent l="0" t="0" r="0" b="0"/>
                 <wp:wrapTight wrapText="bothSides">
                   <wp:wrapPolygon edited="0">
-                    <wp:start x="1108" y="4574"/>
-                    <wp:lineTo x="1108" y="16772"/>
-                    <wp:lineTo x="21046" y="16772"/>
-                    <wp:lineTo x="21046" y="4574"/>
-                    <wp:lineTo x="1108" y="4574"/>
+                    <wp:start x="1943" y="0"/>
+                    <wp:lineTo x="648" y="1878"/>
+                    <wp:lineTo x="1295" y="15026"/>
+                    <wp:lineTo x="2591" y="19409"/>
+                    <wp:lineTo x="3886" y="20661"/>
+                    <wp:lineTo x="6801" y="20661"/>
+                    <wp:lineTo x="19754" y="16278"/>
+                    <wp:lineTo x="20726" y="13774"/>
+                    <wp:lineTo x="19106" y="10017"/>
+                    <wp:lineTo x="8744" y="0"/>
+                    <wp:lineTo x="1943" y="0"/>
                   </wp:wrapPolygon>
                 </wp:wrapTight>
-                <wp:docPr id="1" name="Imagen 1"/>
+                <wp:docPr id="3" name="Imagen 3"/>
                 <wp:cNvGraphicFramePr>
                   <a:graphicFrameLocks xmlns:a="http://schemas.openxmlformats.org/drawingml/2006/main" noChangeAspect="1"/>
                 </wp:cNvGraphicFramePr>
@@ -9754,7 +9697,7 @@
                   <a:graphicData uri="http://schemas.openxmlformats.org/drawingml/2006/picture">
                     <pic:pic xmlns:pic="http://schemas.openxmlformats.org/drawingml/2006/picture">
                       <pic:nvPicPr>
-                        <pic:cNvPr id="1" name="DGCA.png"/>
+                        <pic:cNvPr id="3" name="escudo.png"/>
                         <pic:cNvPicPr/>
                       </pic:nvPicPr>
                       <pic:blipFill>
@@ -9772,7 +9715,7 @@
                       <pic:spPr>
                         <a:xfrm>
                           <a:off x="0" y="0"/>
-                          <a:ext cx="1485900" cy="269875"/>
+                          <a:ext cx="1270635" cy="657225"/>
                         </a:xfrm>
                         <a:prstGeom prst="rect">
                           <a:avLst/>
@@ -9799,33 +9742,26 @@
               <w:lang w:eastAsia="es-EC"/>
             </w:rPr>
             <w:drawing>
-              <wp:anchor distT="0" distB="0" distL="114300" distR="114300" simplePos="0" relativeHeight="251659264" behindDoc="1" locked="0" layoutInCell="1" allowOverlap="1" wp14:anchorId="7B92EF49" wp14:editId="7165B6C1">
+              <wp:anchor distT="0" distB="0" distL="114300" distR="114300" simplePos="0" relativeHeight="251658240" behindDoc="1" locked="0" layoutInCell="1" allowOverlap="1" wp14:anchorId="2CF85B8F" wp14:editId="4B943EAC">
                 <wp:simplePos x="0" y="0"/>
                 <wp:positionH relativeFrom="column">
-                  <wp:posOffset>368935</wp:posOffset>
+                  <wp:posOffset>1270</wp:posOffset>
                 </wp:positionH>
                 <wp:positionV relativeFrom="paragraph">
-                  <wp:posOffset>-10160</wp:posOffset>
+                  <wp:posOffset>567690</wp:posOffset>
                 </wp:positionV>
-                <wp:extent cx="952500" cy="492125"/>
-                <wp:effectExtent l="0" t="0" r="0" b="3175"/>
+                <wp:extent cx="1933575" cy="351790"/>
+                <wp:effectExtent l="0" t="0" r="0" b="0"/>
                 <wp:wrapTight wrapText="bothSides">
                   <wp:wrapPolygon edited="0">
-                    <wp:start x="2160" y="0"/>
-                    <wp:lineTo x="432" y="1672"/>
-                    <wp:lineTo x="864" y="15050"/>
-                    <wp:lineTo x="3024" y="19231"/>
-                    <wp:lineTo x="3456" y="20903"/>
-                    <wp:lineTo x="6912" y="20903"/>
-                    <wp:lineTo x="10800" y="19231"/>
-                    <wp:lineTo x="20736" y="15886"/>
-                    <wp:lineTo x="20736" y="10870"/>
-                    <wp:lineTo x="13392" y="3345"/>
-                    <wp:lineTo x="8208" y="0"/>
-                    <wp:lineTo x="2160" y="0"/>
+                    <wp:start x="1277" y="4679"/>
+                    <wp:lineTo x="1277" y="15206"/>
+                    <wp:lineTo x="21068" y="15206"/>
+                    <wp:lineTo x="20855" y="4679"/>
+                    <wp:lineTo x="1277" y="4679"/>
                   </wp:wrapPolygon>
                 </wp:wrapTight>
-                <wp:docPr id="3" name="Imagen 3"/>
+                <wp:docPr id="1" name="Imagen 1"/>
                 <wp:cNvGraphicFramePr>
                   <a:graphicFrameLocks xmlns:a="http://schemas.openxmlformats.org/drawingml/2006/main" noChangeAspect="1"/>
                 </wp:cNvGraphicFramePr>
@@ -9833,7 +9769,7 @@
                   <a:graphicData uri="http://schemas.openxmlformats.org/drawingml/2006/picture">
                     <pic:pic xmlns:pic="http://schemas.openxmlformats.org/drawingml/2006/picture">
                       <pic:nvPicPr>
-                        <pic:cNvPr id="3" name="escudo.png"/>
+                        <pic:cNvPr id="1" name="DGCA.png"/>
                         <pic:cNvPicPr/>
                       </pic:nvPicPr>
                       <pic:blipFill>
@@ -9851,7 +9787,7 @@
                       <pic:spPr>
                         <a:xfrm>
                           <a:off x="0" y="0"/>
-                          <a:ext cx="952500" cy="492125"/>
+                          <a:ext cx="1933575" cy="351790"/>
                         </a:xfrm>
                         <a:prstGeom prst="rect">
                           <a:avLst/>
@@ -9869,7 +9805,6 @@
               </wp:anchor>
             </w:drawing>
           </w:r>
-          <w:bookmarkEnd w:id="0"/>
         </w:p>
       </w:tc>
       <w:tc>
@@ -10043,13 +9978,7 @@
             <w:rPr>
               <w:sz w:val="14"/>
             </w:rPr>
-            <w:t>PC-D</w:t>
-          </w:r>
-          <w:r>
-            <w:rPr>
-              <w:sz w:val="14"/>
-            </w:rPr>
-            <w:t>TIC.DDPTI.1.1-F.01</w:t>
+            <w:t>PC-CGTIC.DDPTI.1.1-F.01</w:t>
           </w:r>
         </w:p>
       </w:tc>
@@ -10194,16 +10123,6 @@
       </w:tc>
     </w:tr>
   </w:tbl>
-  <w:p>
-    <w:pPr>
-      <w:pStyle w:val="Encabezado"/>
-    </w:pPr>
-  </w:p>
-</w:hdr>
-</file>
-
-<file path=word/header3.xml><?xml version="1.0" encoding="utf-8"?>
-<w:hdr xmlns:wpc="http://schemas.microsoft.com/office/word/2010/wordprocessingCanvas" xmlns:mc="http://schemas.openxmlformats.org/markup-compatibility/2006" xmlns:o="urn:schemas-microsoft-com:office:office" xmlns:r="http://schemas.openxmlformats.org/officeDocument/2006/relationships" xmlns:m="http://schemas.openxmlformats.org/officeDocument/2006/math" xmlns:v="urn:schemas-microsoft-com:vml" xmlns:wp14="http://schemas.microsoft.com/office/word/2010/wordprocessingDrawing" xmlns:wp="http://schemas.openxmlformats.org/drawingml/2006/wordprocessingDrawing" xmlns:w10="urn:schemas-microsoft-com:office:word" xmlns:w="http://schemas.openxmlformats.org/wordprocessingml/2006/main" xmlns:w14="http://schemas.microsoft.com/office/word/2010/wordml" xmlns:w15="http://schemas.microsoft.com/office/word/2012/wordml" xmlns:wpg="http://schemas.microsoft.com/office/word/2010/wordprocessingGroup" xmlns:wpi="http://schemas.microsoft.com/office/word/2010/wordprocessingInk" xmlns:wne="http://schemas.microsoft.com/office/word/2006/wordml" xmlns:wps="http://schemas.microsoft.com/office/word/2010/wordprocessingShape" mc:Ignorable="w14 w15 wp14">
   <w:p>
     <w:pPr>
       <w:pStyle w:val="Encabezado"/>
@@ -12513,7 +12432,7 @@
 </file>
 
 <file path=customXml/itemProps1.xml><?xml version="1.0" encoding="utf-8"?>
-<ds:datastoreItem xmlns:ds="http://schemas.openxmlformats.org/officeDocument/2006/customXml" ds:itemID="{B332C75F-8766-462E-B382-E2F3186EC291}">
+<ds:datastoreItem xmlns:ds="http://schemas.openxmlformats.org/officeDocument/2006/customXml" ds:itemID="{A5108A46-B963-4D9C-B027-03CADCA54166}">
   <ds:schemaRefs>
     <ds:schemaRef ds:uri="http://schemas.openxmlformats.org/officeDocument/2006/bibliography"/>
   </ds:schemaRefs>

</xml_diff>